<commit_message>
update tables and figures
</commit_message>
<xml_diff>
--- a/outputs/tables/Table1_Study_Characteristics.docx
+++ b/outputs/tables/Table1_Study_Characteristics.docx
@@ -321,7 +321,7 @@
                 <w:szCs w:val="18"/>
                 <w:color w:val="000000"/>
               </w:rPr>
-              <w:t xml:space="preserve">(N = 57)</w:t>
+              <w:t xml:space="preserve">(N = 56)</w:t>
             </w:r>
             <w:r>
               <w:rPr>
@@ -499,7 +499,7 @@
                 <w:szCs w:val="18"/>
                 <w:color w:val="000000"/>
               </w:rPr>
-              <w:t xml:space="preserve">(N = 44)</w:t>
+              <w:t xml:space="preserve">(N = 43)</w:t>
             </w:r>
             <w:r>
               <w:rPr>
@@ -855,7 +855,7 @@
                 <w:szCs w:val="18"/>
                 <w:color w:val="000000"/>
               </w:rPr>
-              <w:t xml:space="preserve">(N = 25)</w:t>
+              <w:t xml:space="preserve">(N = 24)</w:t>
             </w:r>
             <w:r>
               <w:rPr>
@@ -1712,7 +1712,7 @@
                 <w:szCs w:val="18"/>
                 <w:color w:val="000000"/>
               </w:rPr>
-              <w:t xml:space="preserve">1 (4.0%)</w:t>
+              <w:t xml:space="preserve">1 (4.2%)</w:t>
             </w:r>
           </w:p>
         </w:tc>
@@ -1822,7 +1822,7 @@
                 <w:szCs w:val="18"/>
                 <w:color w:val="000000"/>
               </w:rPr>
-              <w:t xml:space="preserve">3 (5.3%)</w:t>
+              <w:t xml:space="preserve">3 (5.4%)</w:t>
             </w:r>
           </w:p>
         </w:tc>
@@ -2134,7 +2134,7 @@
                 <w:szCs w:val="18"/>
                 <w:color w:val="000000"/>
               </w:rPr>
-              <w:t xml:space="preserve">1 (4.0%)</w:t>
+              <w:t xml:space="preserve">1 (4.2%)</w:t>
             </w:r>
           </w:p>
         </w:tc>
@@ -2556,7 +2556,7 @@
                 <w:szCs w:val="18"/>
                 <w:color w:val="000000"/>
               </w:rPr>
-              <w:t xml:space="preserve">3 (12%)</w:t>
+              <w:t xml:space="preserve">3 (13%)</w:t>
             </w:r>
           </w:p>
         </w:tc>
@@ -2666,7 +2666,7 @@
                 <w:szCs w:val="18"/>
                 <w:color w:val="000000"/>
               </w:rPr>
-              <w:t xml:space="preserve">44 (77%)</w:t>
+              <w:t xml:space="preserve">43 (77%)</w:t>
             </w:r>
           </w:p>
         </w:tc>
@@ -2770,7 +2770,7 @@
                 <w:szCs w:val="18"/>
                 <w:color w:val="000000"/>
               </w:rPr>
-              <w:t xml:space="preserve">44 (100%)</w:t>
+              <w:t xml:space="preserve">43 (100%)</w:t>
             </w:r>
           </w:p>
         </w:tc>
@@ -2978,7 +2978,7 @@
                 <w:szCs w:val="18"/>
                 <w:color w:val="000000"/>
               </w:rPr>
-              <w:t xml:space="preserve">19 (76%)</w:t>
+              <w:t xml:space="preserve">18 (75%)</w:t>
             </w:r>
           </w:p>
         </w:tc>
@@ -3088,7 +3088,7 @@
                 <w:szCs w:val="18"/>
                 <w:color w:val="000000"/>
               </w:rPr>
-              <w:t xml:space="preserve">3 (5.3%)</w:t>
+              <w:t xml:space="preserve">3 (5.4%)</w:t>
             </w:r>
           </w:p>
         </w:tc>
@@ -3400,7 +3400,7 @@
                 <w:szCs w:val="18"/>
                 <w:color w:val="000000"/>
               </w:rPr>
-              <w:t xml:space="preserve">1 (4.0%)</w:t>
+              <w:t xml:space="preserve">1 (4.2%)</w:t>
             </w:r>
           </w:p>
         </w:tc>
@@ -4354,7 +4354,7 @@
                 <w:szCs w:val="18"/>
                 <w:color w:val="000000"/>
               </w:rPr>
-              <w:t xml:space="preserve">4 (7.0%)</w:t>
+              <w:t xml:space="preserve">4 (7.1%)</w:t>
             </w:r>
           </w:p>
         </w:tc>
@@ -4458,7 +4458,7 @@
                 <w:szCs w:val="18"/>
                 <w:color w:val="000000"/>
               </w:rPr>
-              <w:t xml:space="preserve">4 (9.1%)</w:t>
+              <w:t xml:space="preserve">4 (9.3%)</w:t>
             </w:r>
           </w:p>
         </w:tc>
@@ -6042,7 +6042,7 @@
                 <w:szCs w:val="18"/>
                 <w:color w:val="000000"/>
               </w:rPr>
-              <w:t xml:space="preserve">25 (44%)</w:t>
+              <w:t xml:space="preserve">24 (43%)</w:t>
             </w:r>
           </w:p>
         </w:tc>
@@ -6146,7 +6146,7 @@
                 <w:szCs w:val="18"/>
                 <w:color w:val="000000"/>
               </w:rPr>
-              <w:t xml:space="preserve">19 (43%)</w:t>
+              <w:t xml:space="preserve">18 (42%)</w:t>
             </w:r>
           </w:p>
         </w:tc>
@@ -6354,7 +6354,7 @@
                 <w:szCs w:val="18"/>
                 <w:color w:val="000000"/>
               </w:rPr>
-              <w:t xml:space="preserve">25 (100%)</w:t>
+              <w:t xml:space="preserve">24 (100%)</w:t>
             </w:r>
           </w:p>
         </w:tc>
@@ -6990,7 +6990,7 @@
                 <w:szCs w:val="18"/>
                 <w:color w:val="000000"/>
               </w:rPr>
-              <w:t xml:space="preserve">1 (2.3%)</w:t>
+              <w:t xml:space="preserve">1 (2.4%)</w:t>
             </w:r>
           </w:p>
         </w:tc>
@@ -7198,7 +7198,7 @@
                 <w:szCs w:val="18"/>
                 <w:color w:val="000000"/>
               </w:rPr>
-              <w:t xml:space="preserve">1 (4.0%)</w:t>
+              <w:t xml:space="preserve">1 (4.2%)</w:t>
             </w:r>
           </w:p>
         </w:tc>
@@ -7412,7 +7412,7 @@
                 <w:szCs w:val="18"/>
                 <w:color w:val="000000"/>
               </w:rPr>
-              <w:t xml:space="preserve">1 (2.3%)</w:t>
+              <w:t xml:space="preserve">1 (2.4%)</w:t>
             </w:r>
           </w:p>
         </w:tc>
@@ -8256,7 +8256,7 @@
                 <w:szCs w:val="18"/>
                 <w:color w:val="000000"/>
               </w:rPr>
-              <w:t xml:space="preserve">1 (2.3%)</w:t>
+              <w:t xml:space="preserve">1 (2.4%)</w:t>
             </w:r>
           </w:p>
         </w:tc>
@@ -8678,7 +8678,7 @@
                 <w:szCs w:val="18"/>
                 <w:color w:val="000000"/>
               </w:rPr>
-              <w:t xml:space="preserve">1 (2.3%)</w:t>
+              <w:t xml:space="preserve">1 (2.4%)</w:t>
             </w:r>
           </w:p>
         </w:tc>
@@ -8996,7 +8996,7 @@
                 <w:szCs w:val="18"/>
                 <w:color w:val="000000"/>
               </w:rPr>
-              <w:t xml:space="preserve">8 (14%)</w:t>
+              <w:t xml:space="preserve">8 (15%)</w:t>
             </w:r>
           </w:p>
         </w:tc>
@@ -9100,7 +9100,7 @@
                 <w:szCs w:val="18"/>
                 <w:color w:val="000000"/>
               </w:rPr>
-              <w:t xml:space="preserve">2 (4.7%)</w:t>
+              <w:t xml:space="preserve">2 (4.8%)</w:t>
             </w:r>
           </w:p>
         </w:tc>
@@ -9308,7 +9308,7 @@
                 <w:szCs w:val="18"/>
                 <w:color w:val="000000"/>
               </w:rPr>
-              <w:t xml:space="preserve">7 (28%)</w:t>
+              <w:t xml:space="preserve">7 (29%)</w:t>
             </w:r>
           </w:p>
         </w:tc>
@@ -9418,7 +9418,7 @@
                 <w:szCs w:val="18"/>
                 <w:color w:val="000000"/>
               </w:rPr>
-              <w:t xml:space="preserve">43 (77%)</w:t>
+              <w:t xml:space="preserve">42 (76%)</w:t>
             </w:r>
           </w:p>
         </w:tc>
@@ -9522,7 +9522,7 @@
                 <w:szCs w:val="18"/>
                 <w:color w:val="000000"/>
               </w:rPr>
-              <w:t xml:space="preserve">37 (86%)</w:t>
+              <w:t xml:space="preserve">36 (86%)</w:t>
             </w:r>
           </w:p>
         </w:tc>
@@ -9730,7 +9730,7 @@
                 <w:szCs w:val="18"/>
                 <w:color w:val="000000"/>
               </w:rPr>
-              <w:t xml:space="preserve">17 (68%)</w:t>
+              <w:t xml:space="preserve">16 (67%)</w:t>
             </w:r>
           </w:p>
         </w:tc>
@@ -10262,7 +10262,7 @@
                 <w:szCs w:val="18"/>
                 <w:color w:val="000000"/>
               </w:rPr>
-              <w:t xml:space="preserve">33.0 (16.0, 90.0)</w:t>
+              <w:t xml:space="preserve">31.5 (15.0, 91.0)</w:t>
             </w:r>
           </w:p>
         </w:tc>
@@ -10366,7 +10366,7 @@
                 <w:szCs w:val="18"/>
                 <w:color w:val="000000"/>
               </w:rPr>
-              <w:t xml:space="preserve">42.0 (18.0, 91.0)</w:t>
+              <w:t xml:space="preserve">38.0 (18.0, 92.0)</w:t>
             </w:r>
           </w:p>
         </w:tc>
@@ -10574,7 +10574,7 @@
                 <w:szCs w:val="18"/>
                 <w:color w:val="000000"/>
               </w:rPr>
-              <w:t xml:space="preserve">25.0 (7.0, 90.0)</w:t>
+              <w:t xml:space="preserve">23.5 (6.0, 91.0)</w:t>
             </w:r>
           </w:p>
         </w:tc>
@@ -10684,7 +10684,7 @@
                 <w:szCs w:val="18"/>
                 <w:color w:val="000000"/>
               </w:rPr>
-              <w:t xml:space="preserve">29.0 (14.0, 42.0)</w:t>
+              <w:t xml:space="preserve">30.0 (14.0, 42.0)</w:t>
             </w:r>
           </w:p>
         </w:tc>
@@ -10996,7 +10996,7 @@
                 <w:szCs w:val="18"/>
                 <w:color w:val="000000"/>
               </w:rPr>
-              <w:t xml:space="preserve">14.0 (14.0, 34.5)</w:t>
+              <w:t xml:space="preserve">14.0 (14.0, 38.0)</w:t>
             </w:r>
           </w:p>
         </w:tc>
@@ -11950,7 +11950,7 @@
                 <w:szCs w:val="18"/>
                 <w:color w:val="000000"/>
               </w:rPr>
-              <w:t xml:space="preserve">23</w:t>
+              <w:t xml:space="preserve">22</w:t>
             </w:r>
           </w:p>
         </w:tc>
@@ -12054,7 +12054,7 @@
                 <w:szCs w:val="18"/>
                 <w:color w:val="000000"/>
               </w:rPr>
-              <w:t xml:space="preserve">19</w:t>
+              <w:t xml:space="preserve">18</w:t>
             </w:r>
           </w:p>
         </w:tc>
@@ -12262,7 +12262,7 @@
                 <w:szCs w:val="18"/>
                 <w:color w:val="000000"/>
               </w:rPr>
-              <w:t xml:space="preserve">10</w:t>
+              <w:t xml:space="preserve">9</w:t>
             </w:r>
           </w:p>
         </w:tc>
@@ -12372,7 +12372,7 @@
                 <w:szCs w:val="18"/>
                 <w:color w:val="000000"/>
               </w:rPr>
-              <w:t xml:space="preserve">50.0 (40.0, 59.3)</w:t>
+              <w:t xml:space="preserve">50.0 (39.5, 58.9)</w:t>
             </w:r>
           </w:p>
         </w:tc>
@@ -12476,7 +12476,7 @@
                 <w:szCs w:val="18"/>
                 <w:color w:val="000000"/>
               </w:rPr>
-              <w:t xml:space="preserve">50.0 (41.0, 60.0)</w:t>
+              <w:t xml:space="preserve">50.0 (41.0, 59.6)</w:t>
             </w:r>
           </w:p>
         </w:tc>
@@ -12684,7 +12684,7 @@
                 <w:szCs w:val="18"/>
                 <w:color w:val="000000"/>
               </w:rPr>
-              <w:t xml:space="preserve">56.0 (43.7, 60.0)</w:t>
+              <w:t xml:space="preserve">53.8 (43.7, 59.6)</w:t>
             </w:r>
           </w:p>
         </w:tc>
@@ -13742,7 +13742,7 @@
                 <w:szCs w:val="18"/>
                 <w:color w:val="000000"/>
               </w:rPr>
-              <w:t xml:space="preserve">5 (11%)</w:t>
+              <w:t xml:space="preserve">5 (12%)</w:t>
             </w:r>
           </w:p>
         </w:tc>
@@ -14164,7 +14164,7 @@
                 <w:szCs w:val="18"/>
                 <w:color w:val="000000"/>
               </w:rPr>
-              <w:t xml:space="preserve">4 (9.1%)</w:t>
+              <w:t xml:space="preserve">4 (9.3%)</w:t>
             </w:r>
           </w:p>
         </w:tc>
@@ -14372,7 +14372,7 @@
                 <w:szCs w:val="18"/>
                 <w:color w:val="000000"/>
               </w:rPr>
-              <w:t xml:space="preserve">6 (24%)</w:t>
+              <w:t xml:space="preserve">6 (25%)</w:t>
             </w:r>
           </w:p>
         </w:tc>
@@ -14482,7 +14482,7 @@
                 <w:szCs w:val="18"/>
                 <w:color w:val="000000"/>
               </w:rPr>
-              <w:t xml:space="preserve">4 (7.0%)</w:t>
+              <w:t xml:space="preserve">4 (7.1%)</w:t>
             </w:r>
           </w:p>
         </w:tc>
@@ -14904,7 +14904,7 @@
                 <w:szCs w:val="18"/>
                 <w:color w:val="000000"/>
               </w:rPr>
-              <w:t xml:space="preserve">4 (7.0%)</w:t>
+              <w:t xml:space="preserve">4 (7.1%)</w:t>
             </w:r>
           </w:p>
         </w:tc>
@@ -15008,7 +15008,7 @@
                 <w:szCs w:val="18"/>
                 <w:color w:val="000000"/>
               </w:rPr>
-              <w:t xml:space="preserve">2 (4.5%)</w:t>
+              <w:t xml:space="preserve">2 (4.7%)</w:t>
             </w:r>
           </w:p>
         </w:tc>
@@ -15216,7 +15216,7 @@
                 <w:szCs w:val="18"/>
                 <w:color w:val="000000"/>
               </w:rPr>
-              <w:t xml:space="preserve">4 (16%)</w:t>
+              <w:t xml:space="preserve">4 (17%)</w:t>
             </w:r>
           </w:p>
         </w:tc>
@@ -15326,7 +15326,7 @@
                 <w:szCs w:val="18"/>
                 <w:color w:val="000000"/>
               </w:rPr>
-              <w:t xml:space="preserve">37 (65%)</w:t>
+              <w:t xml:space="preserve">36 (64%)</w:t>
             </w:r>
           </w:p>
         </w:tc>
@@ -15430,7 +15430,7 @@
                 <w:szCs w:val="18"/>
                 <w:color w:val="000000"/>
               </w:rPr>
-              <w:t xml:space="preserve">32 (73%)</w:t>
+              <w:t xml:space="preserve">31 (72%)</w:t>
             </w:r>
           </w:p>
         </w:tc>
@@ -15638,7 +15638,7 @@
                 <w:szCs w:val="18"/>
                 <w:color w:val="000000"/>
               </w:rPr>
-              <w:t xml:space="preserve">15 (60%)</w:t>
+              <w:t xml:space="preserve">14 (58%)</w:t>
             </w:r>
           </w:p>
         </w:tc>
@@ -16170,7 +16170,7 @@
                 <w:szCs w:val="18"/>
                 <w:color w:val="000000"/>
               </w:rPr>
-              <w:t xml:space="preserve">12 (34%)</w:t>
+              <w:t xml:space="preserve">12 (35%)</w:t>
             </w:r>
           </w:p>
         </w:tc>
@@ -16274,7 +16274,7 @@
                 <w:szCs w:val="18"/>
                 <w:color w:val="000000"/>
               </w:rPr>
-              <w:t xml:space="preserve">6 (23%)</w:t>
+              <w:t xml:space="preserve">6 (24%)</w:t>
             </w:r>
           </w:p>
         </w:tc>
@@ -16482,7 +16482,7 @@
                 <w:szCs w:val="18"/>
                 <w:color w:val="000000"/>
               </w:rPr>
-              <w:t xml:space="preserve">6 (38%)</w:t>
+              <w:t xml:space="preserve">6 (40%)</w:t>
             </w:r>
           </w:p>
         </w:tc>
@@ -16592,7 +16592,7 @@
                 <w:szCs w:val="18"/>
                 <w:color w:val="000000"/>
               </w:rPr>
-              <w:t xml:space="preserve">2 (5.7%)</w:t>
+              <w:t xml:space="preserve">2 (5.9%)</w:t>
             </w:r>
           </w:p>
         </w:tc>
@@ -16696,7 +16696,7 @@
                 <w:szCs w:val="18"/>
                 <w:color w:val="000000"/>
               </w:rPr>
-              <w:t xml:space="preserve">1 (3.8%)</w:t>
+              <w:t xml:space="preserve">1 (4.0%)</w:t>
             </w:r>
           </w:p>
         </w:tc>
@@ -17118,7 +17118,7 @@
                 <w:szCs w:val="18"/>
                 <w:color w:val="000000"/>
               </w:rPr>
-              <w:t xml:space="preserve">1 (3.8%)</w:t>
+              <w:t xml:space="preserve">1 (4.0%)</w:t>
             </w:r>
           </w:p>
         </w:tc>
@@ -17326,7 +17326,7 @@
                 <w:szCs w:val="18"/>
                 <w:color w:val="000000"/>
               </w:rPr>
-              <w:t xml:space="preserve">1 (6.3%)</w:t>
+              <w:t xml:space="preserve">1 (6.7%)</w:t>
             </w:r>
           </w:p>
         </w:tc>
@@ -17436,7 +17436,7 @@
                 <w:szCs w:val="18"/>
                 <w:color w:val="000000"/>
               </w:rPr>
-              <w:t xml:space="preserve">20 (57%)</w:t>
+              <w:t xml:space="preserve">19 (56%)</w:t>
             </w:r>
           </w:p>
         </w:tc>
@@ -17540,7 +17540,7 @@
                 <w:szCs w:val="18"/>
                 <w:color w:val="000000"/>
               </w:rPr>
-              <w:t xml:space="preserve">18 (69%)</w:t>
+              <w:t xml:space="preserve">17 (68%)</w:t>
             </w:r>
           </w:p>
         </w:tc>
@@ -17748,7 +17748,7 @@
                 <w:szCs w:val="18"/>
                 <w:color w:val="000000"/>
               </w:rPr>
-              <w:t xml:space="preserve">9 (56%)</w:t>
+              <w:t xml:space="preserve">8 (53%)</w:t>
             </w:r>
           </w:p>
         </w:tc>

</xml_diff>